<commit_message>
Update AEO Guidebook formatting and styles for improved hierarchy
Modified the AEO Guidebook document structure by adjusting the formatting of section headers and subheaders for better visual distinction. Updated the build script to reflect these changes, ensuring that section headers (h2) and subheaders (h3) are appropriately sized. Additionally, added CSS styles for subheaders to maintain consistency in the guidebook's presentation.
</commit_message>
<xml_diff>
--- a/AEO-Guidebook.docx
+++ b/AEO-Guidebook.docx
@@ -8,6 +8,10 @@
         <w:spacing w:after="200" w:before="320"/>
       </w:pPr>
       <w:r>
+        <w:rPr>
+          <w:sz w:val="28"/>
+          <w:szCs w:val="28"/>
+        </w:rPr>
         <w:t xml:space="preserve">AEO Guidebook</w:t>
       </w:r>
     </w:p>
@@ -33,6 +37,10 @@
         <w:spacing w:after="200" w:before="320"/>
       </w:pPr>
       <w:r>
+        <w:rPr>
+          <w:sz w:val="28"/>
+          <w:szCs w:val="28"/>
+        </w:rPr>
         <w:t xml:space="preserve">1. The shift: SEO → AEO</w:t>
       </w:r>
     </w:p>
@@ -83,6 +91,10 @@
         <w:spacing w:after="200" w:before="320"/>
       </w:pPr>
       <w:r>
+        <w:rPr>
+          <w:sz w:val="28"/>
+          <w:szCs w:val="28"/>
+        </w:rPr>
         <w:t xml:space="preserve">2. How answer engines work</w:t>
       </w:r>
     </w:p>
@@ -100,6 +112,10 @@
         <w:spacing w:after="160" w:before="280"/>
       </w:pPr>
       <w:r>
+        <w:rPr>
+          <w:sz w:val="22"/>
+          <w:szCs w:val="22"/>
+        </w:rPr>
         <w:t xml:space="preserve">Retrieval</w:t>
       </w:r>
     </w:p>
@@ -117,6 +133,10 @@
         <w:spacing w:after="160" w:before="280"/>
       </w:pPr>
       <w:r>
+        <w:rPr>
+          <w:sz w:val="22"/>
+          <w:szCs w:val="22"/>
+        </w:rPr>
         <w:t xml:space="preserve">Relevance checks</w:t>
       </w:r>
     </w:p>
@@ -134,6 +154,10 @@
         <w:spacing w:after="160" w:before="280"/>
       </w:pPr>
       <w:r>
+        <w:rPr>
+          <w:sz w:val="22"/>
+          <w:szCs w:val="22"/>
+        </w:rPr>
         <w:t xml:space="preserve">Passage extraction</w:t>
       </w:r>
     </w:p>
@@ -151,6 +175,10 @@
         <w:spacing w:after="160" w:before="280"/>
       </w:pPr>
       <w:r>
+        <w:rPr>
+          <w:sz w:val="22"/>
+          <w:szCs w:val="22"/>
+        </w:rPr>
         <w:t xml:space="preserve">Synthesis</w:t>
       </w:r>
     </w:p>
@@ -168,6 +196,10 @@
         <w:spacing w:after="160" w:before="280"/>
       </w:pPr>
       <w:r>
+        <w:rPr>
+          <w:sz w:val="22"/>
+          <w:szCs w:val="22"/>
+        </w:rPr>
         <w:t xml:space="preserve">Citations</w:t>
       </w:r>
     </w:p>
@@ -185,6 +217,10 @@
         <w:spacing w:after="160" w:before="280"/>
       </w:pPr>
       <w:r>
+        <w:rPr>
+          <w:sz w:val="22"/>
+          <w:szCs w:val="22"/>
+        </w:rPr>
         <w:t xml:space="preserve">What this means for writers</w:t>
       </w:r>
     </w:p>
@@ -272,6 +308,10 @@
         <w:spacing w:after="200" w:before="320"/>
       </w:pPr>
       <w:r>
+        <w:rPr>
+          <w:sz w:val="28"/>
+          <w:szCs w:val="28"/>
+        </w:rPr>
         <w:t xml:space="preserve">3. The anatomy of AEO-ready content</w:t>
       </w:r>
     </w:p>
@@ -289,6 +329,10 @@
         <w:spacing w:after="160" w:before="280"/>
       </w:pPr>
       <w:r>
+        <w:rPr>
+          <w:sz w:val="22"/>
+          <w:szCs w:val="22"/>
+        </w:rPr>
         <w:t xml:space="preserve">Answer-first blocks</w:t>
       </w:r>
     </w:p>
@@ -322,6 +366,10 @@
         <w:spacing w:after="160" w:before="280"/>
       </w:pPr>
       <w:r>
+        <w:rPr>
+          <w:sz w:val="22"/>
+          <w:szCs w:val="22"/>
+        </w:rPr>
         <w:t xml:space="preserve">Self-contained paragraphs</w:t>
       </w:r>
     </w:p>
@@ -347,6 +395,10 @@
         <w:spacing w:after="160" w:before="280"/>
       </w:pPr>
       <w:r>
+        <w:rPr>
+          <w:sz w:val="22"/>
+          <w:szCs w:val="22"/>
+        </w:rPr>
         <w:t xml:space="preserve">Extractable units</w:t>
       </w:r>
     </w:p>
@@ -380,6 +432,10 @@
         <w:spacing w:after="160" w:before="280"/>
       </w:pPr>
       <w:r>
+        <w:rPr>
+          <w:sz w:val="22"/>
+          <w:szCs w:val="22"/>
+        </w:rPr>
         <w:t xml:space="preserve">Fan-out coverage</w:t>
       </w:r>
     </w:p>
@@ -485,6 +541,10 @@
         <w:spacing w:after="200" w:before="320"/>
       </w:pPr>
       <w:r>
+        <w:rPr>
+          <w:sz w:val="28"/>
+          <w:szCs w:val="28"/>
+        </w:rPr>
         <w:t xml:space="preserve">4. Trust &amp; defensibility</w:t>
       </w:r>
     </w:p>
@@ -527,6 +587,10 @@
         <w:spacing w:after="160" w:before="280"/>
       </w:pPr>
       <w:r>
+        <w:rPr>
+          <w:sz w:val="22"/>
+          <w:szCs w:val="22"/>
+        </w:rPr>
         <w:t xml:space="preserve">Qualify claims with scope and conditions — Authoritativeness</w:t>
       </w:r>
     </w:p>
@@ -620,6 +684,10 @@
         <w:spacing w:after="160" w:before="280"/>
       </w:pPr>
       <w:r>
+        <w:rPr>
+          <w:sz w:val="22"/>
+          <w:szCs w:val="22"/>
+        </w:rPr>
         <w:t xml:space="preserve">Add evidence without turning it into a research paper — Expertise</w:t>
       </w:r>
     </w:p>
@@ -645,6 +713,10 @@
         <w:spacing w:after="160" w:before="280"/>
       </w:pPr>
       <w:r>
+        <w:rPr>
+          <w:sz w:val="22"/>
+          <w:szCs w:val="22"/>
+        </w:rPr>
         <w:t xml:space="preserve">State limitations without undermining positioning — Trustworthiness</w:t>
       </w:r>
     </w:p>
@@ -704,6 +776,10 @@
         <w:spacing w:after="200" w:before="320"/>
       </w:pPr>
       <w:r>
+        <w:rPr>
+          <w:sz w:val="28"/>
+          <w:szCs w:val="28"/>
+        </w:rPr>
         <w:t xml:space="preserve">5. Mistakes that kill citations</w:t>
       </w:r>
     </w:p>
@@ -721,6 +797,10 @@
         <w:spacing w:after="160" w:before="280"/>
       </w:pPr>
       <w:r>
+        <w:rPr>
+          <w:sz w:val="22"/>
+          <w:szCs w:val="22"/>
+        </w:rPr>
         <w:t xml:space="preserve">Burying the answer</w:t>
       </w:r>
     </w:p>
@@ -738,6 +818,10 @@
         <w:spacing w:after="160" w:before="280"/>
       </w:pPr>
       <w:r>
+        <w:rPr>
+          <w:sz w:val="22"/>
+          <w:szCs w:val="22"/>
+        </w:rPr>
         <w:t xml:space="preserve">Vague superlatives</w:t>
       </w:r>
     </w:p>
@@ -755,6 +839,10 @@
         <w:spacing w:after="160" w:before="280"/>
       </w:pPr>
       <w:r>
+        <w:rPr>
+          <w:sz w:val="22"/>
+          <w:szCs w:val="22"/>
+        </w:rPr>
         <w:t xml:space="preserve">Topic sprawl</w:t>
       </w:r>
     </w:p>
@@ -772,6 +860,10 @@
         <w:spacing w:after="160" w:before="280"/>
       </w:pPr>
       <w:r>
+        <w:rPr>
+          <w:sz w:val="22"/>
+          <w:szCs w:val="22"/>
+        </w:rPr>
         <w:t xml:space="preserve">Comparisons only in images</w:t>
       </w:r>
     </w:p>
@@ -789,6 +881,10 @@
         <w:spacing w:after="160" w:before="280"/>
       </w:pPr>
       <w:r>
+        <w:rPr>
+          <w:sz w:val="22"/>
+          <w:szCs w:val="22"/>
+        </w:rPr>
         <w:t xml:space="preserve">Undefined acronyms</w:t>
       </w:r>
     </w:p>
@@ -806,6 +902,10 @@
         <w:spacing w:after="160" w:before="280"/>
       </w:pPr>
       <w:r>
+        <w:rPr>
+          <w:sz w:val="22"/>
+          <w:szCs w:val="22"/>
+        </w:rPr>
         <w:t xml:space="preserve">Contradictory claims across pages</w:t>
       </w:r>
     </w:p>
@@ -823,6 +923,10 @@
         <w:spacing w:after="160" w:before="280"/>
       </w:pPr>
       <w:r>
+        <w:rPr>
+          <w:sz w:val="22"/>
+          <w:szCs w:val="22"/>
+        </w:rPr>
         <w:t xml:space="preserve">Freshness theater</w:t>
       </w:r>
     </w:p>
@@ -840,6 +944,10 @@
         <w:spacing w:after="200" w:before="320"/>
       </w:pPr>
       <w:r>
+        <w:rPr>
+          <w:sz w:val="28"/>
+          <w:szCs w:val="28"/>
+        </w:rPr>
         <w:t xml:space="preserve">6. One-page cheat sheet</w:t>
       </w:r>
     </w:p>

</xml_diff>